<commit_message>
Update Model Explanation document to cover all project files
</commit_message>
<xml_diff>
--- a/docs/Model_Explanation.docx
+++ b/docs/Model_Explanation.docx
@@ -10,7 +10,7 @@
         <w:rPr>
           <w:color w:val="003366"/>
         </w:rPr>
-        <w:t>Sentiment Analysis Model: Code Explanation</w:t>
+        <w:t>Social Media Sentiment Analysis: Full Project Guide</w:t>
       </w:r>
     </w:p>
     <w:p>
@@ -18,7 +18,7 @@
         <w:rPr>
           <w:b/>
         </w:rPr>
-        <w:t>This document provides a simple and detailed explanation of our sentiment analysis model, focusing on the steps immediately following data preprocessing.</w:t>
+        <w:t>This document explains every file in our project in simple, easy-to-understand terms. This will help you understand how the code works from start to finish.</w:t>
       </w:r>
     </w:p>
     <w:p>
@@ -29,12 +29,53 @@
         <w:rPr>
           <w:color w:val="003366"/>
         </w:rPr>
-        <w:t>1. The Imports (The Tools We Use)</w:t>
+        <w:t>1. Project Overview</w:t>
       </w:r>
     </w:p>
     <w:p>
       <w:r>
-        <w:t>Before we do anything, we need to import the right tools into Python. Think of imports like pulling out different tools from a toolbox.</w:t>
+        <w:t>Our project takes social media comments and predicts whether they are Positive, Negative, or Neutral. We do this in several steps, separated into different Python files:</w:t>
+      </w:r>
+    </w:p>
+    <w:p>
+      <w:r>
+        <w:t>• preprocessing.py: Cleans up messy text.</w:t>
+      </w:r>
+    </w:p>
+    <w:p>
+      <w:r>
+        <w:t>• train_model.py: Teaches the AI using our 11,000 comment dataset.</w:t>
+      </w:r>
+    </w:p>
+    <w:p>
+      <w:r>
+        <w:t>• predict.py: Uses the trained AI to analyze new comments.</w:t>
+      </w:r>
+    </w:p>
+    <w:p>
+      <w:r>
+        <w:t>• statistics.py: Crunches the numbers to show overall sentiment.</w:t>
+      </w:r>
+    </w:p>
+    <w:p>
+      <w:r>
+        <w:t>• gui.py: Provides a visual app for the user to upload files.</w:t>
+      </w:r>
+    </w:p>
+    <w:p>
+      <w:pPr>
+        <w:pStyle w:val="Heading1"/>
+      </w:pPr>
+      <w:r>
+        <w:rPr>
+          <w:color w:val="003366"/>
+        </w:rPr>
+        <w:t>2. preprocessing.py (Cleaning the Data)</w:t>
+      </w:r>
+    </w:p>
+    <w:p>
+      <w:r>
+        <w:t>People type messily on social media. Before the AI can read it, we have to clean the text.</w:t>
       </w:r>
     </w:p>
     <w:p>
@@ -46,45 +87,26 @@
           <w:rFonts w:ascii="Courier New" w:hAnsi="Courier New"/>
           <w:sz w:val="20"/>
         </w:rPr>
-        <w:t>import joblib</w:t>
+        <w:t>text = re.sub(r"http\S+|www\S+|https\S+", "", text)</w:t>
         <w:br/>
-        <w:t>from sklearn.feature_extraction.text import TfidfVectorizer</w:t>
+        <w:t>text = re.sub(r"[^a-zA-Z\s]", "", text)</w:t>
         <w:br/>
-        <w:t>from sklearn.model_selection import train_test_split</w:t>
-        <w:br/>
-        <w:t>from sklearn.linear_model import LogisticRegression</w:t>
-        <w:br/>
-        <w:t>from sklearn.metrics import accuracy_score, classification_report</w:t>
+        <w:t>words = [word for word in words if word not in stop_words]</w:t>
       </w:r>
     </w:p>
     <w:p>
       <w:r>
-        <w:t>• joblib: A tool used to save (or "dump") our trained model so we can use it later without retraining it from scratch.</w:t>
+        <w:t>• We use 're' (Regular Expressions) to search and destroy web links (URLs).</w:t>
       </w:r>
     </w:p>
     <w:p>
       <w:r>
-        <w:t>• sklearn (Scikit-Learn): This is the main machine learning library in Python. We import several specific tools from it:</w:t>
+        <w:t>• We delete all punctuation, numbers, and emojis so only English letters remain.</w:t>
       </w:r>
     </w:p>
     <w:p>
       <w:r>
-        <w:t xml:space="preserve">  - TfidfVectorizer: This translates our text comments into numbers so the math model can understand them.</w:t>
-      </w:r>
-    </w:p>
-    <w:p>
-      <w:r>
-        <w:t xml:space="preserve">  - train_test_split: This cuts our dataset into two pieces: one for learning (training) and one for a final exam (testing).</w:t>
-      </w:r>
-    </w:p>
-    <w:p>
-      <w:r>
-        <w:t xml:space="preserve">  - LogisticRegression: The actual brain/algorithm that will learn how to guess the sentiment.</w:t>
-      </w:r>
-    </w:p>
-    <w:p>
-      <w:r>
-        <w:t xml:space="preserve">  - accuracy_score &amp; classification_report: Tools to check the model's "report card" and see how well it performed.</w:t>
+        <w:t>• We use the 'NLTK' library to remove "stop words." Stop words are common words like "the", "and", or "is" that don't tell us anything about sentiment.</w:t>
       </w:r>
     </w:p>
     <w:p>
@@ -95,12 +117,12 @@
         <w:rPr>
           <w:color w:val="003366"/>
         </w:rPr>
-        <w:t>2. Feature Extraction (Turning Text into Numbers)</w:t>
+        <w:t>3. train_model.py (Teaching the AI)</w:t>
       </w:r>
     </w:p>
     <w:p>
       <w:r>
-        <w:t>Machine learning models cannot read English words like "good" or "terrible." They only understand numbers. Feature extraction translates the text into a numerical format.</w:t>
+        <w:t>This script loads our huge 11,000-comment dataset and trains a Machine Learning model.</w:t>
       </w:r>
     </w:p>
     <w:p>
@@ -112,36 +134,29 @@
           <w:rFonts w:ascii="Courier New" w:hAnsi="Courier New"/>
           <w:sz w:val="20"/>
         </w:rPr>
-        <w:t>vectorizer = TfidfVectorizer(ngram_range=(1, 2), stop_words='english', max_features=5000)</w:t>
+        <w:t>vectorizer = TfidfVectorizer(ngram_range=(1, 2), stop_words='english')</w:t>
         <w:br/>
         <w:t>X = vectorizer.fit_transform(df["cleaned_comment"])</w:t>
         <w:br/>
-        <w:t>y = df["sentiment"]</w:t>
+        <w:br/>
+        <w:t>model = LogisticRegression(max_iter=1000)</w:t>
+        <w:br/>
+        <w:t>model.fit(X_train, y_train)</w:t>
       </w:r>
     </w:p>
     <w:p>
       <w:r>
-        <w:t>• TfidfVectorizer: We use a technique called TF-IDF (Term Frequency-Inverse Document Frequency). It looks at how often a word appears in a comment but scales it down if the word is too common across all comments (like "the", "is").</w:t>
+        <w:t>• TfidfVectorizer: The AI doesn't understand words, only math. This tool converts our sentences into numerical scores. 'ngram_range=(1, 2)' means it looks at single words AND pairs of words (like "not good").</w:t>
       </w:r>
     </w:p>
     <w:p>
       <w:r>
-        <w:t>• stop_words='english': Automatically ignores common English words (like "and", "the") that don't help determine sentiment.</w:t>
+        <w:t>• Logistic Regression: This is our AI brain. We show it 80% of our data (the training set) and say, "Find the mathematical pattern that makes a comment Positive or Negative."</w:t>
       </w:r>
     </w:p>
     <w:p>
       <w:r>
-        <w:t>• ngram_range=(1,2): Instead of just looking at single words (like "not" and "good"), it also looks at pairs of words together (like "not good"). This captures a lot more context!</w:t>
-      </w:r>
-    </w:p>
-    <w:p>
-      <w:r>
-        <w:t>• X: This is our new matrix of numbers (features) representing all the comments.</w:t>
-      </w:r>
-    </w:p>
-    <w:p>
-      <w:r>
-        <w:t>• y: This is the actual answer key (the sentiments: Positive, Negative, Neutral).</w:t>
+        <w:t>• Once trained, our model achieved a ~94.8% accuracy on the test exam! We then use 'joblib.dump' to save this trained brain into '.pkl' files so we don't have to retrain it every time.</w:t>
       </w:r>
     </w:p>
     <w:p>
@@ -152,12 +167,12 @@
         <w:rPr>
           <w:color w:val="003366"/>
         </w:rPr>
-        <w:t>3. Train-Test Split (Preparing for the Exam)</w:t>
+        <w:t>4. predict.py (Making New Guesses)</w:t>
       </w:r>
     </w:p>
     <w:p>
       <w:r>
-        <w:t>If we let the model learn on all our data, we wouldn't have any unseen data left to test it on. It would be like giving a student the exam questions to study with!</w:t>
+        <w:t>Now that the AI is smart and saved to a file, this script loads it up to analyze brand-new comments.</w:t>
       </w:r>
     </w:p>
     <w:p>
@@ -169,26 +184,29 @@
           <w:rFonts w:ascii="Courier New" w:hAnsi="Courier New"/>
           <w:sz w:val="20"/>
         </w:rPr>
-        <w:t>X_train, X_test, y_train, y_test = train_test_split(</w:t>
+        <w:t>model = joblib.load(model_path)</w:t>
         <w:br/>
-        <w:t xml:space="preserve">    X, y, test_size=0.2, random_state=42</w:t>
+        <w:t>vectorizer = joblib.load(vectorizer_path)</w:t>
         <w:br/>
-        <w:t>)</w:t>
+        <w:br/>
+        <w:t>text_features = vectorizer.transform([cleaned_text])</w:t>
+        <w:br/>
+        <w:t>prediction = model.predict(text_features)</w:t>
       </w:r>
     </w:p>
     <w:p>
       <w:r>
-        <w:t>• We use train_test_split to chop our data into two groups.</w:t>
+        <w:t>• joblib.load: Wakes up our saved model from the hard drive.</w:t>
       </w:r>
     </w:p>
     <w:p>
       <w:r>
-        <w:t>• test_size=0.2: This means 80% of our 11,000 comments (8,800) will be used to train the model, and 20% (2,200) will be hidden away as the final test.</w:t>
+        <w:t>• vectorizer.transform: Turns the new user comment into math numbers exactly the same way we did during training.</w:t>
       </w:r>
     </w:p>
     <w:p>
       <w:r>
-        <w:t>• random_state=42: This just ensures the data is shuffled exactly the same way every time we run the code.</w:t>
+        <w:t>• model.predict: The AI looks at the numbers and spits out a final guess: Positive, Negative, or Neutral.</w:t>
       </w:r>
     </w:p>
     <w:p>
@@ -199,12 +217,12 @@
         <w:rPr>
           <w:color w:val="003366"/>
         </w:rPr>
-        <w:t>4. Training the Model (Logistic Regression)</w:t>
+        <w:t>5. statistics.py (Crunching the Numbers)</w:t>
       </w:r>
     </w:p>
     <w:p>
       <w:r>
-        <w:t>Now we actually build and train the AI.</w:t>
+        <w:t>Once we have predictions for hundreds of comments, we want to see the big picture.</w:t>
       </w:r>
     </w:p>
     <w:p>
@@ -216,19 +234,19 @@
           <w:rFonts w:ascii="Courier New" w:hAnsi="Courier New"/>
           <w:sz w:val="20"/>
         </w:rPr>
-        <w:t>model = LogisticRegression(max_iter=1000)</w:t>
+        <w:t>counts = df["sentiment"].value_counts()</w:t>
         <w:br/>
-        <w:t>model.fit(X_train, y_train)</w:t>
+        <w:t>positive_pct = (positive_count / total) * 100</w:t>
       </w:r>
     </w:p>
     <w:p>
       <w:r>
-        <w:t>• Logistic Regression: Despite the word 'regression', this is an algorithm used for classification. It tries to draw statistical lines between what makes a comment Positive, Negative, or Neutral based on the numerical TF-IDF scores.</w:t>
+        <w:t>• We use the 'Pandas' library to count how many comments fell into each bucket.</w:t>
       </w:r>
     </w:p>
     <w:p>
       <w:r>
-        <w:t>• model.fit(X_train, y_train): This is where the actual learning happens. We feed the model the training data (X_train) and the correct answers (y_train). The model adjusts its internal math to get the answers right as often as possible.</w:t>
+        <w:t>• We calculate percentages to show the user exactly what portion of their audience is happy versus unhappy.</w:t>
       </w:r>
     </w:p>
     <w:p>
@@ -239,12 +257,12 @@
         <w:rPr>
           <w:color w:val="003366"/>
         </w:rPr>
-        <w:t>5. Evaluating the Model (The Final Exam)</w:t>
+        <w:t>6. gui.py (The Visual App)</w:t>
       </w:r>
     </w:p>
     <w:p>
       <w:r>
-        <w:t>Once the model has learned, we need to test it on the 20% of data it has never seen before.</w:t>
+        <w:t>Users don't want to type code; they want buttons to click. We built a desktop app using 'Tkinter'.</w:t>
       </w:r>
     </w:p>
     <w:p>
@@ -256,66 +274,27 @@
           <w:rFonts w:ascii="Courier New" w:hAnsi="Courier New"/>
           <w:sz w:val="20"/>
         </w:rPr>
-        <w:t>y_pred = model.predict(X_test)</w:t>
+        <w:t>import tkinter as tk</w:t>
         <w:br/>
-        <w:t>accuracy = accuracy_score(y_test, y_pred)</w:t>
+        <w:t>from tkinter import filedialog</w:t>
         <w:br/>
-        <w:t>print(classification_report(y_test, y_pred))</w:t>
+        <w:br/>
+        <w:t>file_path = filedialog.askopenfilename()</w:t>
       </w:r>
     </w:p>
     <w:p>
       <w:r>
-        <w:t>• model.predict(X_test): We give the model the unseen test comments and ask it to predict the sentiments.</w:t>
+        <w:t>• Tkinter (tk): This is Python's built-in tool for drawing windows, buttons, and text boxes.</w:t>
       </w:r>
     </w:p>
     <w:p>
       <w:r>
-        <w:t>• accuracy_score: We compare the model's guesses (y_pred) to the actual real answers (y_test). Our model gets an accuracy of about 94.8%!</w:t>
+        <w:t>• filedialog: This opens up your computer's standard file browser so the user can visually select their CSV file to upload.</w:t>
       </w:r>
     </w:p>
     <w:p>
       <w:r>
-        <w:t>• classification_report: This prints out a detailed breakdown showing how well the model performed on each specific category (Positive vs. Negative vs. Neutral).</w:t>
-      </w:r>
-    </w:p>
-    <w:p>
-      <w:pPr>
-        <w:pStyle w:val="Heading1"/>
-      </w:pPr>
-      <w:r>
-        <w:rPr>
-          <w:color w:val="003366"/>
-        </w:rPr>
-        <w:t>6. Saving the Model for the Future</w:t>
-      </w:r>
-    </w:p>
-    <w:p>
-      <w:r>
-        <w:t>Finally, we don't want to retrain the model every single time we want to predict a new tweet or comment.</w:t>
-      </w:r>
-    </w:p>
-    <w:p>
-      <w:pPr>
-        <w:pStyle w:val="IntenseQuote"/>
-      </w:pPr>
-      <w:r>
-        <w:rPr>
-          <w:rFonts w:ascii="Courier New" w:hAnsi="Courier New"/>
-          <w:sz w:val="20"/>
-        </w:rPr>
-        <w:t>joblib.dump(model, model_path)</w:t>
-        <w:br/>
-        <w:t>joblib.dump(vectorizer, vectorizer_path)</w:t>
-      </w:r>
-    </w:p>
-    <w:p>
-      <w:r>
-        <w:t>• joblib.dump: This compresses and saves both our trained Logistic Regression model and our TF-IDF Vectorizer into physical files (.pkl files).</w:t>
-      </w:r>
-    </w:p>
-    <w:p>
-      <w:r>
-        <w:t>• When we want to use the app in the future, we just load these files, and the model instantly remembers everything it learned.</w:t>
+        <w:t>• When the user clicks 'Upload', our app grabs the file, runs it through predict.py, and displays the results!</w:t>
       </w:r>
     </w:p>
     <w:sectPr>

</xml_diff>

<commit_message>
docs: expand Model_Explanation with theory and code, update README for Logistic Regression
</commit_message>
<xml_diff>
--- a/docs/Model_Explanation.docx
+++ b/docs/Model_Explanation.docx
@@ -122,7 +122,28 @@
     </w:p>
     <w:p>
       <w:r>
-        <w:t>This script loads our huge 11,000-comment dataset and trains a Machine Learning model.</w:t>
+        <w:rPr>
+          <w:b/>
+        </w:rPr>
+        <w:t>After preprocessing, we move to training. Here is a brief theory of what happens next:</w:t>
+      </w:r>
+    </w:p>
+    <w:p>
+      <w:r>
+        <w:t>Theory: Machine learning models only understand numbers, not text. Therefore, we must convert our cleaned text into a numerical format. This step is called 'Feature Extraction'. We use TF-IDF (Term Frequency-Inverse Document Frequency), which gives higher importance to unique words that define a sentiment (like 'terrible' or 'amazing') and lowers the importance of common words.</w:t>
+      </w:r>
+    </w:p>
+    <w:p>
+      <w:r>
+        <w:t>Once converted to numbers, we split our data: 80% to train the model, and 20% to test it. We use Logistic Regression, which is a statistical model that finds the relationship between the words (features) and the sentiment (labels). It calculates the probability that a comment belongs to a specific category.</w:t>
+      </w:r>
+    </w:p>
+    <w:p>
+      <w:r>
+        <w:rPr>
+          <w:b/>
+        </w:rPr>
+        <w:t>Here is the detailed code that accomplishes this:</w:t>
       </w:r>
     </w:p>
     <w:p>
@@ -134,29 +155,59 @@
           <w:rFonts w:ascii="Courier New" w:hAnsi="Courier New"/>
           <w:sz w:val="20"/>
         </w:rPr>
-        <w:t>vectorizer = TfidfVectorizer(ngram_range=(1, 2), stop_words='english')</w:t>
+        <w:t># 1. Create the TF-IDF Vectorizer</w:t>
+        <w:br/>
+        <w:t># ngram_range=(1, 2) means we look at single words and 2-word phrases</w:t>
+        <w:br/>
+        <w:t># max_features=5000 limits the vocabulary to the top 5000 words</w:t>
+        <w:br/>
+        <w:t>vectorizer = TfidfVectorizer(ngram_range=(1, 2), stop_words='english', max_features=5000)</w:t>
+        <w:br/>
+        <w:br/>
+        <w:t># 2. Convert text to numbers</w:t>
+        <w:br/>
+        <w:t># fit_transform learns the vocabulary and transforms the text into a matrix (X)</w:t>
         <w:br/>
         <w:t>X = vectorizer.fit_transform(df["cleaned_comment"])</w:t>
         <w:br/>
         <w:br/>
+        <w:t># 3. Define the labels (what we want to predict)</w:t>
+        <w:br/>
+        <w:t>y = df["sentiment"]</w:t>
+        <w:br/>
+        <w:br/>
+        <w:t># 4. Split data into training (80%) and testing (20%)</w:t>
+        <w:br/>
+        <w:t>X_train, X_test, y_train, y_test = train_test_split(</w:t>
+        <w:br/>
+        <w:t xml:space="preserve">    X, y, test_size=0.2, random_state=42</w:t>
+        <w:br/>
+        <w:t>)</w:t>
+        <w:br/>
+        <w:br/>
+        <w:t># 5. Create and Train the Logistic Regression Model</w:t>
+        <w:br/>
+        <w:t># max_iter=1000 ensures it has enough time to find the best mathematical pattern</w:t>
+        <w:br/>
         <w:t>model = LogisticRegression(max_iter=1000)</w:t>
         <w:br/>
         <w:t>model.fit(X_train, y_train)</w:t>
-      </w:r>
-    </w:p>
-    <w:p>
-      <w:r>
-        <w:t>• TfidfVectorizer: The AI doesn't understand words, only math. This tool converts our sentences into numerical scores. 'ngram_range=(1, 2)' means it looks at single words AND pairs of words (like "not good").</w:t>
-      </w:r>
-    </w:p>
-    <w:p>
-      <w:r>
-        <w:t>• Logistic Regression: This is our AI brain. We show it 80% of our data (the training set) and say, "Find the mathematical pattern that makes a comment Positive or Negative."</w:t>
-      </w:r>
-    </w:p>
-    <w:p>
-      <w:r>
-        <w:t>• Once trained, our model achieved a ~94.8% accuracy on the test exam! We then use 'joblib.dump' to save this trained brain into '.pkl' files so we don't have to retrain it every time.</w:t>
+        <w:br/>
+        <w:br/>
+        <w:t># 6. Evaluate and Save</w:t>
+        <w:br/>
+        <w:t># We predict on the test set to see how well it learned</w:t>
+        <w:br/>
+        <w:t>y_pred = model.predict(X_test)</w:t>
+        <w:br/>
+        <w:t>accuracy = accuracy_score(y_test, y_pred)</w:t>
+        <w:br/>
+        <w:br/>
+        <w:t># Finally, save the trained model and vectorizer for future use</w:t>
+        <w:br/>
+        <w:t>joblib.dump(model, 'model.pkl')</w:t>
+        <w:br/>
+        <w:t>joblib.dump(vectorizer, 'vectorizer.pkl')</w:t>
       </w:r>
     </w:p>
     <w:p>

</xml_diff>

<commit_message>
feat: generate predicted_sentiments.csv and update docs and imports explanation
</commit_message>
<xml_diff>
--- a/docs/Model_Explanation.docx
+++ b/docs/Model_Explanation.docx
@@ -70,7 +70,68 @@
         <w:rPr>
           <w:color w:val="003366"/>
         </w:rPr>
-        <w:t>2. preprocessing.py (Cleaning the Data)</w:t>
+        <w:t>2. Understanding the Python Imports</w:t>
+      </w:r>
+    </w:p>
+    <w:p>
+      <w:r>
+        <w:t>Across our project, we import several libraries. Here is what each one does:</w:t>
+      </w:r>
+    </w:p>
+    <w:p>
+      <w:r>
+        <w:t>• pandas: Used to load, manipulate, and analyze our data using DataFrames (like Excel tables in code).</w:t>
+      </w:r>
+    </w:p>
+    <w:p>
+      <w:r>
+        <w:t>• os: A built-in library to handle file paths and directories, ensuring our code works on Mac, Windows, and Linux.</w:t>
+      </w:r>
+    </w:p>
+    <w:p>
+      <w:r>
+        <w:t>• re: The Regular Expression library, used for searching and replacing specific text patterns (like removing URLs).</w:t>
+      </w:r>
+    </w:p>
+    <w:p>
+      <w:r>
+        <w:t>• nltk (Natural Language Toolkit): We use this to download and remove 'stopwords' (common words like 'the' or 'is' that don't add meaning).</w:t>
+      </w:r>
+    </w:p>
+    <w:p>
+      <w:r>
+        <w:t>• sklearn (Scikit-Learn): Our main Machine Learning library. We import 'TfidfVectorizer' to convert text to numbers, 'LogisticRegression' for the AI model, 'train_test_split' to divide our data, and metrics to check accuracy.</w:t>
+      </w:r>
+    </w:p>
+    <w:p>
+      <w:r>
+        <w:t>• joblib: Used to save our trained model and vectorizer to disk so we can load them later without retraining.</w:t>
+      </w:r>
+    </w:p>
+    <w:p>
+      <w:r>
+        <w:t>• tkinter: Python's standard GUI library. We use it to build the desktop window, buttons, and file dialogs.</w:t>
+      </w:r>
+    </w:p>
+    <w:p>
+      <w:r>
+        <w:t>• numpy: Used for fast mathematical and numerical operations on arrays.</w:t>
+      </w:r>
+    </w:p>
+    <w:p>
+      <w:r>
+        <w:t>• docx: The library used to generate this Word document programmatically!</w:t>
+      </w:r>
+    </w:p>
+    <w:p>
+      <w:pPr>
+        <w:pStyle w:val="Heading1"/>
+      </w:pPr>
+      <w:r>
+        <w:rPr>
+          <w:color w:val="003366"/>
+        </w:rPr>
+        <w:t>3. preprocessing.py (Cleaning the Data)</w:t>
       </w:r>
     </w:p>
     <w:p>
@@ -117,7 +178,7 @@
         <w:rPr>
           <w:color w:val="003366"/>
         </w:rPr>
-        <w:t>3. train_model.py (Teaching the AI)</w:t>
+        <w:t>4. train_model.py (Teaching the AI)</w:t>
       </w:r>
     </w:p>
     <w:p>
@@ -218,7 +279,7 @@
         <w:rPr>
           <w:color w:val="003366"/>
         </w:rPr>
-        <w:t>4. predict.py (Making New Guesses)</w:t>
+        <w:t>5. predict.py (Making New Guesses)</w:t>
       </w:r>
     </w:p>
     <w:p>
@@ -261,6 +322,11 @@
       </w:r>
     </w:p>
     <w:p>
+      <w:r>
+        <w:t>• CSV Export: Finally, it saves these exact predictions into 'predicted_sentiments.csv' so our stats and graphs modules can use them!</w:t>
+      </w:r>
+    </w:p>
+    <w:p>
       <w:pPr>
         <w:pStyle w:val="Heading1"/>
       </w:pPr>
@@ -268,12 +334,12 @@
         <w:rPr>
           <w:color w:val="003366"/>
         </w:rPr>
-        <w:t>5. statistics.py (Crunching the Numbers)</w:t>
+        <w:t>6. statistics.py (Crunching the Numbers)</w:t>
       </w:r>
     </w:p>
     <w:p>
       <w:r>
-        <w:t>Once we have predictions for hundreds of comments, we want to see the big picture.</w:t>
+        <w:t>Once we have our 'predicted_sentiments.csv', we want to see the big picture.</w:t>
       </w:r>
     </w:p>
     <w:p>
@@ -292,7 +358,7 @@
     </w:p>
     <w:p>
       <w:r>
-        <w:t>• We use the 'Pandas' library to count how many comments fell into each bucket.</w:t>
+        <w:t>• We use the 'Pandas' library to read the predicted CSV and count how many comments fell into each bucket.</w:t>
       </w:r>
     </w:p>
     <w:p>
@@ -308,7 +374,7 @@
         <w:rPr>
           <w:color w:val="003366"/>
         </w:rPr>
-        <w:t>6. gui.py (The Visual App)</w:t>
+        <w:t>7. gui.py (The Visual App)</w:t>
       </w:r>
     </w:p>
     <w:p>

</xml_diff>

<commit_message>
feat: implement modular architecture and desktop sentiment dashboard
</commit_message>
<xml_diff>
--- a/docs/Model_Explanation.docx
+++ b/docs/Model_Explanation.docx
@@ -34,32 +34,47 @@
     </w:p>
     <w:p>
       <w:r>
-        <w:t>Our project takes social media comments and predicts whether they are Positive, Negative, or Neutral. We do this in several steps, separated into different Python files:</w:t>
+        <w:t>Our project takes social media comments and predicts whether they are Positive, Negative, or Neutral. We do this in several steps, separated into modular packages:</w:t>
       </w:r>
     </w:p>
     <w:p>
       <w:r>
-        <w:t>• preprocessing.py: Cleans up messy text.</w:t>
+        <w:t>• app.py: Main application entry point.</w:t>
       </w:r>
     </w:p>
     <w:p>
       <w:r>
-        <w:t>• train_model.py: Teaches the AI using our 11,000 comment dataset.</w:t>
+        <w:t>• src/core/preprocess.py: Cleans up messy text.</w:t>
       </w:r>
     </w:p>
     <w:p>
       <w:r>
-        <w:t>• predict.py: Uses the trained AI to analyze new comments.</w:t>
+        <w:t>• src/core/train.py: Teaches the AI using our 11,000 comment dataset.</w:t>
       </w:r>
     </w:p>
     <w:p>
       <w:r>
-        <w:t>• statistics.py: Crunches the numbers to show overall sentiment.</w:t>
+        <w:t>• src/core/predict.py: Uses the trained AI to analyze new comments.</w:t>
       </w:r>
     </w:p>
     <w:p>
       <w:r>
-        <w:t>• gui.py: Provides a visual app for the user to upload files.</w:t>
+        <w:t>• src/core/model_manager.py: Manages loading and automatic training of ML models.</w:t>
+      </w:r>
+    </w:p>
+    <w:p>
+      <w:r>
+        <w:t>• src/core/pipeline.py: End-to-end pipeline linking preprocessing, prediction, and analytics.</w:t>
+      </w:r>
+    </w:p>
+    <w:p>
+      <w:r>
+        <w:t>• src/analytics/statistics.py: Crunches the numbers to show overall sentiment and text stats.</w:t>
+      </w:r>
+    </w:p>
+    <w:p>
+      <w:r>
+        <w:t>• src/ui/ui_manager.py: Tkinter dashboard UI for dataset upload, manual comment entry, and analytics.</w:t>
       </w:r>
     </w:p>
     <w:p>
@@ -110,7 +125,7 @@
     </w:p>
     <w:p>
       <w:r>
-        <w:t>• tkinter: Python's standard GUI library. We use it to build the desktop window, buttons, and file dialogs.</w:t>
+        <w:t>• tkinter: Python's standard GUI library. We use it to build the desktop window, buttons, and analytics tables.</w:t>
       </w:r>
     </w:p>
     <w:p>
@@ -131,7 +146,7 @@
         <w:rPr>
           <w:color w:val="003366"/>
         </w:rPr>
-        <w:t>3. preprocessing.py (Cleaning the Data)</w:t>
+        <w:t>3. src/core/preprocess.py (Cleaning the Data)</w:t>
       </w:r>
     </w:p>
     <w:p>
@@ -178,7 +193,7 @@
         <w:rPr>
           <w:color w:val="003366"/>
         </w:rPr>
-        <w:t>4. train_model.py (Teaching the AI)</w:t>
+        <w:t>4. src/core/train.py (Teaching the AI)</w:t>
       </w:r>
     </w:p>
     <w:p>
@@ -218,16 +233,10 @@
         </w:rPr>
         <w:t># 1. Create the TF-IDF Vectorizer</w:t>
         <w:br/>
-        <w:t># ngram_range=(1, 2) means we look at single words and 2-word phrases</w:t>
-        <w:br/>
-        <w:t># max_features=5000 limits the vocabulary to the top 5000 words</w:t>
-        <w:br/>
         <w:t>vectorizer = TfidfVectorizer(ngram_range=(1, 2), stop_words='english', max_features=5000)</w:t>
         <w:br/>
         <w:br/>
         <w:t># 2. Convert text to numbers</w:t>
-        <w:br/>
-        <w:t># fit_transform learns the vocabulary and transforms the text into a matrix (X)</w:t>
         <w:br/>
         <w:t>X = vectorizer.fit_transform(df["cleaned_comment"])</w:t>
         <w:br/>
@@ -248,8 +257,6 @@
         <w:br/>
         <w:t># 5. Create and Train the Logistic Regression Model</w:t>
         <w:br/>
-        <w:t># max_iter=1000 ensures it has enough time to find the best mathematical pattern</w:t>
-        <w:br/>
         <w:t>model = LogisticRegression(max_iter=1000)</w:t>
         <w:br/>
         <w:t>model.fit(X_train, y_train)</w:t>
@@ -257,16 +264,14 @@
         <w:br/>
         <w:t># 6. Evaluate and Save</w:t>
         <w:br/>
-        <w:t># We predict on the test set to see how well it learned</w:t>
-        <w:br/>
         <w:t>y_pred = model.predict(X_test)</w:t>
         <w:br/>
         <w:t>accuracy = accuracy_score(y_test, y_pred)</w:t>
         <w:br/>
         <w:br/>
-        <w:t># Finally, save the trained model and vectorizer for future use</w:t>
+        <w:t># Save the trained model and vectorizer for future use</w:t>
         <w:br/>
-        <w:t>joblib.dump(model, 'model.pkl')</w:t>
+        <w:t>joblib.dump(model, 'sentiment_model.pkl')</w:t>
         <w:br/>
         <w:t>joblib.dump(vectorizer, 'vectorizer.pkl')</w:t>
       </w:r>
@@ -279,7 +284,7 @@
         <w:rPr>
           <w:color w:val="003366"/>
         </w:rPr>
-        <w:t>5. predict.py (Making New Guesses)</w:t>
+        <w:t>5. src/core/predict.py (Making New Guesses)</w:t>
       </w:r>
     </w:p>
     <w:p>
@@ -296,9 +301,7 @@
           <w:rFonts w:ascii="Courier New" w:hAnsi="Courier New"/>
           <w:sz w:val="20"/>
         </w:rPr>
-        <w:t>model = joblib.load(model_path)</w:t>
-        <w:br/>
-        <w:t>vectorizer = joblib.load(vectorizer_path)</w:t>
+        <w:t>model, vectorizer = ModelManager().get_models()</w:t>
         <w:br/>
         <w:br/>
         <w:t>text_features = vectorizer.transform([cleaned_text])</w:t>
@@ -308,7 +311,7 @@
     </w:p>
     <w:p>
       <w:r>
-        <w:t>• joblib.load: Wakes up our saved model from the hard drive.</w:t>
+        <w:t>• ModelManager: Ensures pre-trained model and vectorizer are loaded from disk or trained automatically.</w:t>
       </w:r>
     </w:p>
     <w:p>
@@ -323,7 +326,7 @@
     </w:p>
     <w:p>
       <w:r>
-        <w:t>• CSV Export: Finally, it saves these exact predictions into 'predicted_sentiments.csv' so our stats and graphs modules can use them!</w:t>
+        <w:t>• CSV Export: Saves predictions into 'predicted_sentiments.csv' for downstream analytics.</w:t>
       </w:r>
     </w:p>
     <w:p>
@@ -334,12 +337,12 @@
         <w:rPr>
           <w:color w:val="003366"/>
         </w:rPr>
-        <w:t>6. statistics.py (Crunching the Numbers)</w:t>
+        <w:t>6. src/analytics/statistics.py (Crunching the Numbers)</w:t>
       </w:r>
     </w:p>
     <w:p>
       <w:r>
-        <w:t>Once we have our 'predicted_sentiments.csv', we want to see the big picture.</w:t>
+        <w:t>Once we have our predictions, we aggregate the numbers.</w:t>
       </w:r>
     </w:p>
     <w:p>
@@ -358,12 +361,12 @@
     </w:p>
     <w:p>
       <w:r>
-        <w:t>• We use the 'Pandas' library to read the predicted CSV and count how many comments fell into each bucket.</w:t>
+        <w:t>• We use Pandas to read the predicted dataset and count how many comments fell into each bucket.</w:t>
       </w:r>
     </w:p>
     <w:p>
       <w:r>
-        <w:t>• We calculate percentages to show the user exactly what portion of their audience is happy versus unhappy.</w:t>
+        <w:t>• We calculate frequency counts and text length metrics for dashboard display.</w:t>
       </w:r>
     </w:p>
     <w:p>
@@ -374,12 +377,12 @@
         <w:rPr>
           <w:color w:val="003366"/>
         </w:rPr>
-        <w:t>7. gui.py (The Visual App)</w:t>
+        <w:t>7. src/ui/ui_manager.py &amp; app.py (The Desktop Dashboard)</w:t>
       </w:r>
     </w:p>
     <w:p>
       <w:r>
-        <w:t>Users don't want to type code; they want buttons to click. We built a desktop app using 'Tkinter'.</w:t>
+        <w:t>Users interact with a clean desktop dashboard built using Tkinter.</w:t>
       </w:r>
     </w:p>
     <w:p>
@@ -393,25 +396,24 @@
         </w:rPr>
         <w:t>import tkinter as tk</w:t>
         <w:br/>
-        <w:t>from tkinter import filedialog</w:t>
+        <w:t>from src.ui.ui_manager import SentimentApp</w:t>
         <w:br/>
         <w:br/>
-        <w:t>file_path = filedialog.askopenfilename()</w:t>
+        <w:t>root = tk.Tk()</w:t>
+        <w:br/>
+        <w:t>app = SentimentApp(root)</w:t>
+        <w:br/>
+        <w:t>root.mainloop()</w:t>
       </w:r>
     </w:p>
     <w:p>
       <w:r>
-        <w:t>• Tkinter (tk): This is Python's built-in tool for drawing windows, buttons, and text boxes.</w:t>
+        <w:t>• SentimentApp: Renders the home screen, file upload controls, loading states, and analytics summary cards and tables.</w:t>
       </w:r>
     </w:p>
     <w:p>
       <w:r>
-        <w:t>• filedialog: This opens up your computer's standard file browser so the user can visually select their CSV file to upload.</w:t>
-      </w:r>
-    </w:p>
-    <w:p>
-      <w:r>
-        <w:t>• When the user clicks 'Upload', our app grabs the file, runs it through predict.py, and displays the results!</w:t>
+        <w:t>• When the user clicks 'ANALYZE SENTIMENTS', our app runs the full pipeline in a background thread and updates the UI!</w:t>
       </w:r>
     </w:p>
     <w:sectPr>

</xml_diff>